<commit_message>
Recrutamento: classificacao A/B/C de prescritores por habilitacao; skills com plano de uso
Classe A (CRM ativo) prescreve; B (revalidacao em curso, Revalida
semestral por edital, ciclo tipico de 8-18 meses) e nutrido sem funcao
assistencial; C (especialista estrangeiro sem CRM) vai ao conselho
cientifico. Lead B ou C jamais aparece como prescritor. Documento de
skills ganha plano de uso imediato por frente e lacunas conhecidas.

Co-Authored-By: Claude <noreply@anthropic.com>
Claude-Session: https://claude.ai/code/session_018WZd4PZy53xqMaYcFDrxLe
</commit_message>
<xml_diff>
--- a/docs/cannabis/RECRUTAMENTO_MEDICOS_PRESCRITORES.docx
+++ b/docs/cannabis/RECRUTAMENTO_MEDICOS_PRESCRITORES.docx
@@ -380,6 +380,289 @@
       </w:r>
       <w:r>
         <w:t xml:space="preserve">Interesse em telemedicina (Resolucao CFM 2.314/2022 permite atender o pais inteiro).</w:t>
+      </w:r>
+    </w:p>
+    <w:p>
+      <w:pPr>
+        <w:pStyle w:val="Heading1"/>
+        <w:jc w:val="center"/>
+      </w:pPr>
+      <w:r>
+        <w:rPr>
+          <w:b/>
+          <w:bCs/>
+        </w:rPr>
+        <w:t xml:space="preserve">Classificacao do lead por habilitacao</w:t>
+      </w:r>
+    </w:p>
+    <w:p>
+      <w:pPr>
+        <w:spacing w:after="160"/>
+        <w:jc w:val="both"/>
+      </w:pPr>
+      <w:r>
+        <w:t xml:space="preserve">Todo lead entra numa das tres classes abaixo antes de qualquer proposta. Base: so prescreve no Brasil quem tem CRM ativo; a revalidacao de diploma estrangeiro (Revalida INEP) e semestral e por edital — nao existe "fazer a qualquer momento".</w:t>
+      </w:r>
+    </w:p>
+    <w:tbl>
+      <w:tblPr>
+        <w:tblW w:type="dxa" w:w="9360"/>
+        <w:tblBorders>
+          <w:top w:val="single" w:color="auto" w:sz="4"/>
+          <w:left w:val="single" w:color="auto" w:sz="4"/>
+          <w:bottom w:val="single" w:color="auto" w:sz="4"/>
+          <w:right w:val="single" w:color="auto" w:sz="4"/>
+          <w:insideH w:val="single" w:color="auto" w:sz="4"/>
+          <w:insideV w:val="single" w:color="auto" w:sz="4"/>
+        </w:tblBorders>
+      </w:tblPr>
+      <w:tblGrid>
+        <w:gridCol w:w="2340"/>
+        <w:gridCol w:w="2340"/>
+        <w:gridCol w:w="2340"/>
+        <w:gridCol w:w="2340"/>
+      </w:tblGrid>
+      <w:tr>
+        <w:tc>
+          <w:tcPr>
+            <w:tcW w:type="dxa" w:w="2340"/>
+          </w:tcPr>
+          <w:p>
+            <w:r>
+              <w:rPr>
+                <w:b/>
+                <w:bCs/>
+              </w:rPr>
+              <w:t xml:space="preserve">Classe</w:t>
+            </w:r>
+          </w:p>
+        </w:tc>
+        <w:tc>
+          <w:tcPr>
+            <w:tcW w:type="dxa" w:w="2340"/>
+          </w:tcPr>
+          <w:p>
+            <w:r>
+              <w:rPr>
+                <w:b/>
+                <w:bCs/>
+              </w:rPr>
+              <w:t xml:space="preserve">Quem e</w:t>
+            </w:r>
+          </w:p>
+        </w:tc>
+        <w:tc>
+          <w:tcPr>
+            <w:tcW w:type="dxa" w:w="2340"/>
+          </w:tcPr>
+          <w:p>
+            <w:r>
+              <w:rPr>
+                <w:b/>
+                <w:bCs/>
+              </w:rPr>
+              <w:t xml:space="preserve">O que pode fazer</w:t>
+            </w:r>
+          </w:p>
+        </w:tc>
+        <w:tc>
+          <w:tcPr>
+            <w:tcW w:type="dxa" w:w="2340"/>
+          </w:tcPr>
+          <w:p>
+            <w:r>
+              <w:rPr>
+                <w:b/>
+                <w:bCs/>
+              </w:rPr>
+              <w:t xml:space="preserve">Tratamento no funil</w:t>
+            </w:r>
+          </w:p>
+        </w:tc>
+      </w:tr>
+      <w:tr>
+        <w:tc>
+          <w:tcPr>
+            <w:tcW w:type="dxa" w:w="2340"/>
+          </w:tcPr>
+          <w:p>
+            <w:r>
+              <w:rPr>
+                <w:b w:val="false"/>
+                <w:bCs w:val="false"/>
+              </w:rPr>
+              <w:t xml:space="preserve">A — Prescritor apto</w:t>
+            </w:r>
+          </w:p>
+        </w:tc>
+        <w:tc>
+          <w:tcPr>
+            <w:tcW w:type="dxa" w:w="2340"/>
+          </w:tcPr>
+          <w:p>
+            <w:r>
+              <w:rPr>
+                <w:b w:val="false"/>
+                <w:bCs w:val="false"/>
+              </w:rPr>
+              <w:t xml:space="preserve">CRM ativo no Brasil, verificado no portal do CFM</w:t>
+            </w:r>
+          </w:p>
+        </w:tc>
+        <w:tc>
+          <w:tcPr>
+            <w:tcW w:type="dxa" w:w="2340"/>
+          </w:tcPr>
+          <w:p>
+            <w:r>
+              <w:rPr>
+                <w:b w:val="false"/>
+                <w:bCs w:val="false"/>
+              </w:rPr>
+              <w:t xml:space="preserve">Prescrever e atender na plataforma</w:t>
+            </w:r>
+          </w:p>
+        </w:tc>
+        <w:tc>
+          <w:tcPr>
+            <w:tcW w:type="dxa" w:w="2340"/>
+          </w:tcPr>
+          <w:p>
+            <w:r>
+              <w:rPr>
+                <w:b w:val="false"/>
+                <w:bCs w:val="false"/>
+              </w:rPr>
+              <w:t xml:space="preserve">Cadencia completa; proposta de contrato</w:t>
+            </w:r>
+          </w:p>
+        </w:tc>
+      </w:tr>
+      <w:tr>
+        <w:tc>
+          <w:tcPr>
+            <w:tcW w:type="dxa" w:w="2340"/>
+          </w:tcPr>
+          <w:p>
+            <w:r>
+              <w:rPr>
+                <w:b w:val="false"/>
+                <w:bCs w:val="false"/>
+              </w:rPr>
+              <w:t xml:space="preserve">B — Pipeline futuro</w:t>
+            </w:r>
+          </w:p>
+        </w:tc>
+        <w:tc>
+          <w:tcPr>
+            <w:tcW w:type="dxa" w:w="2340"/>
+          </w:tcPr>
+          <w:p>
+            <w:r>
+              <w:rPr>
+                <w:b w:val="false"/>
+                <w:bCs w:val="false"/>
+              </w:rPr>
+              <w:t xml:space="preserve">Formado no exterior em revalidacao (Revalida INEP semestral, ou universidade publica via Plataforma Carolina Bori)</w:t>
+            </w:r>
+          </w:p>
+        </w:tc>
+        <w:tc>
+          <w:tcPr>
+            <w:tcW w:type="dxa" w:w="2340"/>
+          </w:tcPr>
+          <w:p>
+            <w:r>
+              <w:rPr>
+                <w:b w:val="false"/>
+                <w:bCs w:val="false"/>
+              </w:rPr>
+              <w:t xml:space="preserve">Nada assistencial ate obter o CRM</w:t>
+            </w:r>
+          </w:p>
+        </w:tc>
+        <w:tc>
+          <w:tcPr>
+            <w:tcW w:type="dxa" w:w="2340"/>
+          </w:tcPr>
+          <w:p>
+            <w:r>
+              <w:rPr>
+                <w:b w:val="false"/>
+                <w:bCs w:val="false"/>
+              </w:rPr>
+              <w:t xml:space="preserve">Nutrir relacionamento; ciclo tipico ate o CRM e de 8 a 18 meses; reclassificar para A somente apos verificacao no CFM</w:t>
+            </w:r>
+          </w:p>
+        </w:tc>
+      </w:tr>
+      <w:tr>
+        <w:tc>
+          <w:tcPr>
+            <w:tcW w:type="dxa" w:w="2340"/>
+          </w:tcPr>
+          <w:p>
+            <w:r>
+              <w:rPr>
+                <w:b w:val="false"/>
+                <w:bCs w:val="false"/>
+              </w:rPr>
+              <w:t xml:space="preserve">C — Conselho cientifico</w:t>
+            </w:r>
+          </w:p>
+        </w:tc>
+        <w:tc>
+          <w:tcPr>
+            <w:tcW w:type="dxa" w:w="2340"/>
+          </w:tcPr>
+          <w:p>
+            <w:r>
+              <w:rPr>
+                <w:b w:val="false"/>
+                <w:bCs w:val="false"/>
+              </w:rPr>
+              <w:t xml:space="preserve">Especialista estrangeiro sem CRM e sem plano de revalidar</w:t>
+            </w:r>
+          </w:p>
+        </w:tc>
+        <w:tc>
+          <w:tcPr>
+            <w:tcW w:type="dxa" w:w="2340"/>
+          </w:tcPr>
+          <w:p>
+            <w:r>
+              <w:rPr>
+                <w:b w:val="false"/>
+                <w:bCs w:val="false"/>
+              </w:rPr>
+              <w:t xml:space="preserve">Funcao nao assistencial: P&amp;D, protocolos, formacao</w:t>
+            </w:r>
+          </w:p>
+        </w:tc>
+        <w:tc>
+          <w:tcPr>
+            <w:tcW w:type="dxa" w:w="2340"/>
+          </w:tcPr>
+          <w:p>
+            <w:r>
+              <w:rPr>
+                <w:b w:val="false"/>
+                <w:bCs w:val="false"/>
+              </w:rPr>
+              <w:t xml:space="preserve">Convite ao conselho cientifico; remuneracao por reuniao ou projeto</w:t>
+            </w:r>
+          </w:p>
+        </w:tc>
+      </w:tr>
+    </w:tbl>
+    <w:p/>
+    <w:p>
+      <w:pPr>
+        <w:spacing w:after="160"/>
+        <w:jc w:val="both"/>
+      </w:pPr>
+      <w:r>
+        <w:t xml:space="preserve">Regra dura: lead B ou C jamais aparece como "prescritor" em nenhum material, pagina ou proposta. Prescricao por nao habilitado e exercicio ilegal da medicina e contamina a plataforma inteira.</w:t>
       </w:r>
     </w:p>
     <w:p>

</xml_diff>